<commit_message>
Punch: uniform rules fetched fresh + 'No' blocks (server too); clear not-at-office / poor-accuracy messages; Lite mode removed; notifications grouped by area with tabs and every notification opens its item
Co-Authored-By: Claude Opus 5.5 <noreply@anthropic.com>
</commit_message>
<xml_diff>
--- a/docs/Kaampilot_Feature_List.docx
+++ b/docs/Kaampilot_Feature_List.docx
@@ -1380,7 +1380,7 @@
                 <w:sz w:val="18"/>
                 <w:szCs w:val="18"/>
               </w:rPr>
-              <w:t xml:space="preserve">17</w:t>
+              <w:t xml:space="preserve">16</w:t>
             </w:r>
           </w:p>
         </w:tc>
@@ -1409,7 +1409,7 @@
                 <w:sz w:val="18"/>
                 <w:szCs w:val="18"/>
               </w:rPr>
-              <w:t xml:space="preserve">13</w:t>
+              <w:t xml:space="preserve">12</w:t>
             </w:r>
           </w:p>
         </w:tc>
@@ -1501,7 +1501,7 @@
                 <w:sz w:val="18"/>
                 <w:szCs w:val="18"/>
               </w:rPr>
-              <w:t xml:space="preserve">12</w:t>
+              <w:t xml:space="preserve">11</w:t>
             </w:r>
           </w:p>
         </w:tc>
@@ -1530,7 +1530,7 @@
                 <w:sz w:val="18"/>
                 <w:szCs w:val="18"/>
               </w:rPr>
-              <w:t xml:space="preserve">12</w:t>
+              <w:t xml:space="preserve">11</w:t>
             </w:r>
           </w:p>
         </w:tc>
@@ -1985,7 +1985,7 @@
                 <w:sz w:val="18"/>
                 <w:szCs w:val="18"/>
               </w:rPr>
-              <w:t xml:space="preserve">273</w:t>
+              <w:t xml:space="preserve">271</w:t>
             </w:r>
           </w:p>
         </w:tc>
@@ -2014,7 +2014,7 @@
                 <w:sz w:val="18"/>
                 <w:szCs w:val="18"/>
               </w:rPr>
-              <w:t xml:space="preserve">240</w:t>
+              <w:t xml:space="preserve">238</w:t>
             </w:r>
           </w:p>
         </w:tc>
@@ -9091,7 +9091,7 @@
                 <w:sz w:val="18"/>
                 <w:szCs w:val="18"/>
               </w:rPr>
-              <w:t xml:space="preserve">When switched on, the phone's location must be inside an office radius; otherwise the punch is refused with the distance ("You are 350 m from Head Office, allowed 200 m"). Clear "Allow location" / "Open settings" help.</w:t>
+              <w:t xml:space="preserve">When switched on, the phone's location must be inside an office radius; otherwise the punch is refused with the distance and the nearest office ("You are not at the office location. You are about 1.2 km away from Head Office; punch in when you reach the office."); a rough GPS fix near the office asks for a better one (±250 m). Clear "Allow location" / "Open settings" help.</w:t>
             </w:r>
           </w:p>
         </w:tc>
@@ -9335,7 +9335,7 @@
                 <w:sz w:val="18"/>
                 <w:szCs w:val="18"/>
               </w:rPr>
-              <w:t xml:space="preserve">Before check-in a pop-up shows the company's message: Reminder only ("OK, punch in") or Ask and record (Yes / No, saved on the day). A "No" never blocks the punch; check-out never asks.</w:t>
+              <w:t xml:space="preserve">Before check-in a pop-up shows the company's message: Reminder only ("OK, punch in") or Must confirm (Yes punches in and is saved on the day; No blocks the punch: "Please wear the company shirt / jersey, then punch in."). Always the current rule, also on a screen left open; check-out never asks.</w:t>
             </w:r>
           </w:p>
         </w:tc>
@@ -12627,7 +12627,7 @@
                 <w:sz w:val="18"/>
                 <w:szCs w:val="18"/>
               </w:rPr>
-              <w:t xml:space="preserve">Off / Reminder only / Ask and record, plus the message (up to 200 characters).</w:t>
+              <w:t xml:space="preserve">Off / Reminder only / Must confirm, plus the message (up to 200 characters).</w:t>
             </w:r>
           </w:p>
         </w:tc>
@@ -20072,7 +20072,7 @@
                 <w:sz w:val="18"/>
                 <w:szCs w:val="18"/>
               </w:rPr>
-              <w:t xml:space="preserve">All notifications with delivery status per channel; mark read, clear.</w:t>
+              <w:t xml:space="preserve">All notifications of every app with tabs All · Attendance · Tasks · Assets · Approvals · Company and unread counts; delivery status per channel; mark read per item or per tab, clear.</w:t>
             </w:r>
           </w:p>
         </w:tc>
@@ -34456,7 +34456,7 @@
           <w:sz w:val="19"/>
           <w:szCs w:val="19"/>
         </w:rPr>
-        <w:t xml:space="preserve">17 features</w:t>
+        <w:t xml:space="preserve">16 features</w:t>
       </w:r>
     </w:p>
     <w:p>
@@ -36285,128 +36285,6 @@
                 <w:szCs w:val="18"/>
               </w:rPr>
               <w:t xml:space="preserve">Try again, or change the server address.</w:t>
-            </w:r>
-          </w:p>
-        </w:tc>
-        <w:tc>
-          <w:tcPr>
-            <w:tcW w:type="dxa" w:w="2138"/>
-            <w:tcBorders>
-              <w:top w:val="single" w:color="D9DCE8" w:sz="4"/>
-              <w:left w:val="single" w:color="D9DCE8" w:sz="4"/>
-              <w:bottom w:val="single" w:color="D9DCE8" w:sz="4"/>
-              <w:right w:val="single" w:color="D9DCE8" w:sz="4"/>
-            </w:tcBorders>
-            <w:tcMar>
-              <w:top w:type="dxa" w:w="70"/>
-              <w:left w:type="dxa" w:w="100"/>
-              <w:bottom w:type="dxa" w:w="70"/>
-              <w:right w:type="dxa" w:w="100"/>
-            </w:tcMar>
-          </w:tcPr>
-          <w:p>
-            <w:r>
-              <w:rPr>
-                <w:b w:val="false"/>
-                <w:bCs w:val="false"/>
-                <w:color w:val="1B1D33"/>
-                <w:sz w:val="18"/>
-                <w:szCs w:val="18"/>
-              </w:rPr>
-              <w:t xml:space="preserve">Everyone</w:t>
-            </w:r>
-          </w:p>
-        </w:tc>
-        <w:tc>
-          <w:tcPr>
-            <w:tcW w:type="dxa" w:w="1200"/>
-            <w:tcBorders>
-              <w:top w:val="single" w:color="D9DCE8" w:sz="4"/>
-              <w:left w:val="single" w:color="D9DCE8" w:sz="4"/>
-              <w:bottom w:val="single" w:color="D9DCE8" w:sz="4"/>
-              <w:right w:val="single" w:color="D9DCE8" w:sz="4"/>
-            </w:tcBorders>
-            <w:shd w:fill="E6F4ED" w:color="auto" w:val="clear"/>
-            <w:tcMar>
-              <w:top w:type="dxa" w:w="70"/>
-              <w:left w:type="dxa" w:w="100"/>
-              <w:bottom w:type="dxa" w:w="70"/>
-              <w:right w:type="dxa" w:w="100"/>
-            </w:tcMar>
-          </w:tcPr>
-          <w:p>
-            <w:r>
-              <w:rPr>
-                <w:b/>
-                <w:bCs/>
-                <w:color w:val="0F7A52"/>
-                <w:sz w:val="17"/>
-                <w:szCs w:val="17"/>
-              </w:rPr>
-              <w:t xml:space="preserve">Live</w:t>
-            </w:r>
-          </w:p>
-        </w:tc>
-      </w:tr>
-      <w:tr>
-        <w:trPr>
-          <w:cantSplit/>
-        </w:trPr>
-        <w:tc>
-          <w:tcPr>
-            <w:tcW w:type="dxa" w:w="2050"/>
-            <w:tcBorders>
-              <w:top w:val="single" w:color="D9DCE8" w:sz="4"/>
-              <w:left w:val="single" w:color="D9DCE8" w:sz="4"/>
-              <w:bottom w:val="single" w:color="D9DCE8" w:sz="4"/>
-              <w:right w:val="single" w:color="D9DCE8" w:sz="4"/>
-            </w:tcBorders>
-            <w:tcMar>
-              <w:top w:type="dxa" w:w="70"/>
-              <w:left w:type="dxa" w:w="100"/>
-              <w:bottom w:type="dxa" w:w="70"/>
-              <w:right w:type="dxa" w:w="100"/>
-            </w:tcMar>
-          </w:tcPr>
-          <w:p>
-            <w:r>
-              <w:rPr>
-                <w:b/>
-                <w:bCs/>
-                <w:color w:val="1B1D33"/>
-                <w:sz w:val="18"/>
-                <w:szCs w:val="18"/>
-              </w:rPr>
-              <w:t xml:space="preserve">Lite mode</w:t>
-            </w:r>
-          </w:p>
-        </w:tc>
-        <w:tc>
-          <w:tcPr>
-            <w:tcW w:type="dxa" w:w="4250"/>
-            <w:tcBorders>
-              <w:top w:val="single" w:color="D9DCE8" w:sz="4"/>
-              <w:left w:val="single" w:color="D9DCE8" w:sz="4"/>
-              <w:bottom w:val="single" w:color="D9DCE8" w:sz="4"/>
-              <w:right w:val="single" w:color="D9DCE8" w:sz="4"/>
-            </w:tcBorders>
-            <w:tcMar>
-              <w:top w:type="dxa" w:w="70"/>
-              <w:left w:type="dxa" w:w="100"/>
-              <w:bottom w:type="dxa" w:w="70"/>
-              <w:right w:type="dxa" w:w="100"/>
-            </w:tcMar>
-          </w:tcPr>
-          <w:p>
-            <w:r>
-              <w:rPr>
-                <w:b w:val="false"/>
-                <w:bCs w:val="false"/>
-                <w:color w:val="1B1D33"/>
-                <w:sz w:val="18"/>
-                <w:szCs w:val="18"/>
-              </w:rPr>
-              <w:t xml:space="preserve">Same as the web app (see Look &amp; usability).</w:t>
             </w:r>
           </w:p>
         </w:tc>
@@ -37023,7 +36901,7 @@
           <w:sz w:val="19"/>
           <w:szCs w:val="19"/>
         </w:rPr>
-        <w:t xml:space="preserve">12 features</w:t>
+        <w:t xml:space="preserve">11 features</w:t>
       </w:r>
     </w:p>
     <w:p>
@@ -37813,128 +37691,6 @@
                 <w:szCs w:val="17"/>
               </w:rPr>
               <w:t xml:space="preserve">Status</w:t>
-            </w:r>
-          </w:p>
-        </w:tc>
-      </w:tr>
-      <w:tr>
-        <w:trPr>
-          <w:cantSplit/>
-        </w:trPr>
-        <w:tc>
-          <w:tcPr>
-            <w:tcW w:type="dxa" w:w="2050"/>
-            <w:tcBorders>
-              <w:top w:val="single" w:color="D9DCE8" w:sz="4"/>
-              <w:left w:val="single" w:color="D9DCE8" w:sz="4"/>
-              <w:bottom w:val="single" w:color="D9DCE8" w:sz="4"/>
-              <w:right w:val="single" w:color="D9DCE8" w:sz="4"/>
-            </w:tcBorders>
-            <w:tcMar>
-              <w:top w:type="dxa" w:w="70"/>
-              <w:left w:type="dxa" w:w="100"/>
-              <w:bottom w:type="dxa" w:w="70"/>
-              <w:right w:type="dxa" w:w="100"/>
-            </w:tcMar>
-          </w:tcPr>
-          <w:p>
-            <w:r>
-              <w:rPr>
-                <w:b/>
-                <w:bCs/>
-                <w:color w:val="1B1D33"/>
-                <w:sz w:val="18"/>
-                <w:szCs w:val="18"/>
-              </w:rPr>
-              <w:t xml:space="preserve">Lite mode</w:t>
-            </w:r>
-          </w:p>
-        </w:tc>
-        <w:tc>
-          <w:tcPr>
-            <w:tcW w:type="dxa" w:w="4250"/>
-            <w:tcBorders>
-              <w:top w:val="single" w:color="D9DCE8" w:sz="4"/>
-              <w:left w:val="single" w:color="D9DCE8" w:sz="4"/>
-              <w:bottom w:val="single" w:color="D9DCE8" w:sz="4"/>
-              <w:right w:val="single" w:color="D9DCE8" w:sz="4"/>
-            </w:tcBorders>
-            <w:tcMar>
-              <w:top w:type="dxa" w:w="70"/>
-              <w:left w:type="dxa" w:w="100"/>
-              <w:bottom w:type="dxa" w:w="70"/>
-              <w:right w:type="dxa" w:w="100"/>
-            </w:tcMar>
-          </w:tcPr>
-          <w:p>
-            <w:r>
-              <w:rPr>
-                <w:b w:val="false"/>
-                <w:bCs w:val="false"/>
-                <w:color w:val="1B1D33"/>
-                <w:sz w:val="18"/>
-                <w:szCs w:val="18"/>
-              </w:rPr>
-              <w:t xml:space="preserve">Turns off heavy effects; switches on automatically for weak devices, data saver or reduced motion; Auto / On / Off.</w:t>
-            </w:r>
-          </w:p>
-        </w:tc>
-        <w:tc>
-          <w:tcPr>
-            <w:tcW w:type="dxa" w:w="2138"/>
-            <w:tcBorders>
-              <w:top w:val="single" w:color="D9DCE8" w:sz="4"/>
-              <w:left w:val="single" w:color="D9DCE8" w:sz="4"/>
-              <w:bottom w:val="single" w:color="D9DCE8" w:sz="4"/>
-              <w:right w:val="single" w:color="D9DCE8" w:sz="4"/>
-            </w:tcBorders>
-            <w:tcMar>
-              <w:top w:type="dxa" w:w="70"/>
-              <w:left w:type="dxa" w:w="100"/>
-              <w:bottom w:type="dxa" w:w="70"/>
-              <w:right w:type="dxa" w:w="100"/>
-            </w:tcMar>
-          </w:tcPr>
-          <w:p>
-            <w:r>
-              <w:rPr>
-                <w:b w:val="false"/>
-                <w:bCs w:val="false"/>
-                <w:color w:val="1B1D33"/>
-                <w:sz w:val="18"/>
-                <w:szCs w:val="18"/>
-              </w:rPr>
-              <w:t xml:space="preserve">Everyone</w:t>
-            </w:r>
-          </w:p>
-        </w:tc>
-        <w:tc>
-          <w:tcPr>
-            <w:tcW w:type="dxa" w:w="1200"/>
-            <w:tcBorders>
-              <w:top w:val="single" w:color="D9DCE8" w:sz="4"/>
-              <w:left w:val="single" w:color="D9DCE8" w:sz="4"/>
-              <w:bottom w:val="single" w:color="D9DCE8" w:sz="4"/>
-              <w:right w:val="single" w:color="D9DCE8" w:sz="4"/>
-            </w:tcBorders>
-            <w:shd w:fill="E6F4ED" w:color="auto" w:val="clear"/>
-            <w:tcMar>
-              <w:top w:type="dxa" w:w="70"/>
-              <w:left w:type="dxa" w:w="100"/>
-              <w:bottom w:type="dxa" w:w="70"/>
-              <w:right w:type="dxa" w:w="100"/>
-            </w:tcMar>
-          </w:tcPr>
-          <w:p>
-            <w:r>
-              <w:rPr>
-                <w:b/>
-                <w:bCs/>
-                <w:color w:val="0F7A52"/>
-                <w:sz w:val="17"/>
-                <w:szCs w:val="17"/>
-              </w:rPr>
-              <w:t xml:space="preserve">Live</w:t>
             </w:r>
           </w:p>
         </w:tc>
@@ -39040,7 +38796,7 @@
                 <w:sz w:val="18"/>
                 <w:szCs w:val="18"/>
               </w:rPr>
-              <w:t xml:space="preserve">One bell for Tasks and Assets: unread count, latest 30, mark all read; a full list in Tasks.</w:t>
+              <w:t xml:space="preserve">One bell for Tasks and Assets with area tabs (All · Attendance · Tasks · Assets · Approvals · Company) and unread counts; unread in bold with a coloured bar; a tap marks it read and opens the item (task, approval, leave, mistake, lead, notice, asset request…); mark all read per tab.</w:t>
             </w:r>
           </w:p>
         </w:tc>

</xml_diff>